<commit_message>
Correcciones de consistencia TFM DSMarket
- 00_tfm_dsmarket.ipynb: nombre del máster corregido a 'Data Science & AI',
  año actualizado de 2025 a 2026, nombres de archivos en tablas de índice
  y arquitectura alineados con los nombres reales del repositorio
- 02_clustering.ipynb: nombre del Cluster 2 en email a Joelle corregido de
  'Crecimiento volátil' a 'Baja rotación volátil', consistente con el
  análisis y la Memoria
- DSMarket_TFM_Memoria.docx: rolling features corregidas de (7, 14, 28 días)
  a (7, 28 días) para reflejar lo implementado en el código; códigos de
  estado M5 (CA, TX, WI) aclarados como identificadores del dataset original,
  no códigos geográficos reales

Co-Authored-By: Claude Sonnet 4.6 <noreply@anthropic.com>
</commit_message>
<xml_diff>
--- a/reports/DSMarket_TFM_Memoria.docx
+++ b/reports/DSMarket_TFM_Memoria.docx
@@ -2475,7 +2475,7 @@
           <w:szCs w:val="22"/>
           <w:rtl w:val="0"/>
         </w:rPr>
-        <w:t xml:space="preserve">Para el contexto de negocio del proyecto, el dataset se ha reinterpretado como si correspondiera a DSMarket (anteriormente TradiStores), seleccionando las tiendas ubicadas en los estados de Nueva York (CA), Boston (TX) y Philadelphia (WI), con tres categorías de producto: SUPERMARKET, HOME &amp; GARDEN y ACCESSORIES.</w:t>
+        <w:t>Para el contexto de negocio del proyecto, el dataset se ha reinterpretado como si correspondiera a DSMarket (anteriormente TradiStores), seleccionando las tiendas ubicadas en los estados de Nueva York (identificador CA en el dataset), Boston (identificador TX) y Philadelphia (identificador WI), con tres categorías de producto: SUPERMARKET, HOME &amp; GARDEN y ACCESSORIES.</w:t>
       </w:r>
       <w:r>
         <w:rPr>
@@ -4264,7 +4264,7 @@
           <w:szCs w:val="22"/>
           <w:rtl w:val="0"/>
         </w:rPr>
-        <w:t xml:space="preserve">Para los modelos de ML se construyen tres grupos de features: variables de lag (ventas con retardo 7, 14, 21 y 28 días), rolling features (medias móviles de 7, 14 y 28 días) y variables de calendario (día de la semana, semana del año, mes, indicador de fin de semana). El modelo E2 incorpora además variables exógenas futuras conocidas (precios y eventos), y E3 añade el cluster de producto.</w:t>
+        <w:t>Para los modelos de ML se construyen tres grupos de features: variables de lag (ventas con retardo 7, 14, 21 y 28 días), rolling features (medias móviles de 7 y 28 días) y variables de calendario (día de la semana, semana del año, mes, indicador de fin de semana). El modelo E2 incorpora además variables exógenas futuras conocidas (precios y eventos), y E3 añade el cluster de producto.</w:t>
       </w:r>
       <w:r>
         <w:rPr>

</xml_diff>